<commit_message>
docs: rewrite self introduction using lecture STAR method
</commit_message>
<xml_diff>
--- a/br-a/site/documents/self-introduction.docx
+++ b/br-a/site/documents/self-introduction.docx
@@ -5,6 +5,7 @@
     <w:p>
       <w:pPr>
         <w:pStyle w:val="Title"/>
+        <w:spacing w:after="80"/>
       </w:pPr>
       <w:r>
         <w:t>석근욱 자기소개서</w:t>
@@ -12,10 +13,23 @@
     </w:p>
     <w:p>
       <w:pPr>
+        <w:pStyle w:val="Subtitle"/>
+      </w:pPr>
+      <w:r>
+        <w:t>정보보안 및 백엔드 직무</w:t>
+      </w:r>
+    </w:p>
+    <w:p>
+      <w:r>
+        <w:t>저는 운영 중인 서비스의 문제를 코드와 연계 흐름으로 살피고, 다른 사람의 의견을 실제 개선으로 연결해 온 개발자입니다. 백엔드 개발 경험을 바탕으로 인증과 서비스 운영을 함께 이해하는 정보보안 직무를 준비하고 있습니다.</w:t>
+      </w:r>
+    </w:p>
+    <w:p>
+      <w:pPr>
         <w:pStyle w:val="Heading1"/>
       </w:pPr>
       <w:r>
-        <w:t>석근욱</w:t>
+        <w:t>운영 기능을 개선한 경험</w:t>
       </w:r>
     </w:p>
     <w:p>
@@ -23,7 +37,7 @@
         <w:widowControl/>
       </w:pPr>
       <w:r>
-        <w:t>저는 함께하는 사람이 좋은 기분이 들게 하는 사람이 되고 싶은 석근욱입니다.</w:t>
+        <w:t>저는 기존 서비스의 코드와 연계 흐름을 분석하고, 수정 결과를 개발 서버에서 확인하며 운영 기능을 개선해 왔습니다. 의왕시 통합예약시스템이 구축을 마치고 운영에 들어간 뒤, 도서관 로그인 연계와 추첨 오류 수정, 강좌 현황 연계를 담당했습니다.</w:t>
       </w:r>
     </w:p>
     <w:p>
@@ -31,7 +45,7 @@
         <w:widowControl/>
       </w:pPr>
       <w:r>
-        <w:t>2021년 군 복무 중 야간 당직을 서다가 선임에게 말과 행동거지를 바로 하라는 지적을 받았습니다. 혼나는 일도 힘들었지만, 제가 그런 사람이라는 생각에 자책했습니다. 생각 없이 말을 내뱉는 일이 많았고 다른 사람을 배려하는 행동도 부족했습니다. 그 경험 이후 다른 사람이 보는 제 모습을 생각하며 말투와 행동을 고치려고 노력했습니다. 다시 일어나기 시작한 정확한 날짜는 남아 있지 않습니다.</w:t>
+        <w:t>Java, Spring, JSP, MariaDB, MyBatis로 구성된 기존 코드를 살펴보고, 통합예약시스템에서 도서관으로 이어지는 JWT 기반 로그인 연계 기능을 구현했습니다. 추첨 로직의 오류를 분석해 수정하고 강좌 현황을 연계하는 기능도 개발했습니다. AI 코딩 도구는 구현 방향과 오류 원인 후보를 탐색하는 데 활용했으며, 제안 내용을 기존 코드와 비교해 직접 검토하고 수정했습니다.</w:t>
       </w:r>
     </w:p>
     <w:p>
@@ -39,7 +53,15 @@
         <w:widowControl/>
       </w:pPr>
       <w:r>
-        <w:t>2023년 군 복무 중에는 일을 기록하지 않고 진행하던 제게 반장이 기록을 남겨두는 것이 좋겠다고 말했습니다. 저는 그 의견을 듣고 업무를 기록하면서 진행했습니다. 실수가 얼마나 줄었는지는 확인할 수 없지만, 들은 의견을 실제 업무 방식에 반영한 경험은 남았습니다.</w:t>
+        <w:t>이후 개발 서버에서 로그인·강좌 현황 연계와 추첨 기능 수정의 정상 동작을 확인했습니다. 이 경험을 통해 새 기능의 구현뿐 아니라 기존 시스템과 연결되는 흐름까지 살펴보는 운영 개발 경험을 쌓았습니다. 인증과 데이터 흐름을 이해한 경험을 바탕으로, 서비스 맥락을 함께 보는 정보보안 업무를 준비하고 있습니다.</w:t>
+      </w:r>
+    </w:p>
+    <w:p>
+      <w:pPr>
+        <w:pStyle w:val="Heading1"/>
+      </w:pPr>
+      <w:r>
+        <w:t>동료의 의견을 업무 방식에 반영한 경험</w:t>
       </w:r>
     </w:p>
     <w:p>
@@ -47,7 +69,7 @@
         <w:widowControl/>
       </w:pPr>
       <w:r>
-        <w:t>2026년 교육과정에서도 집중이 잘되지 않는 날이 있었습니다. 8월 11일에는 집중력이 흐트러질 때 물을 마시기로 하고 쉬는 시간마다 텀블러에 물을 새로 받았습니다. 12일에는 심호흡하며 집중을 상기했다고 적었습니다. 그래도 18일에는 컨디션이 따라주지 않아 강점 행동을 ‘못 했다’고 기록했습니다. 다음 날인 19일 기록에는 쉬는 시간마다 리추얼 내용을 확인했고 ‘실천했다’고 적혀 있습니다. 수업에서의 이 고비는 앞선 군 복무 경험과 별개의 일입니다.</w:t>
+        <w:t>저는 동료의 의견을 듣는 데서 그치지 않고 실제 일하는 방식을 바꾸려고 합니다. 2023년 군 복무 중에는 업무를 기록하지 않고 진행했는데, 반장이 처리 내용을 남겨두는 것이 좋겠다고 제안했습니다.</w:t>
       </w:r>
     </w:p>
     <w:p>
@@ -55,7 +77,16 @@
         <w:widowControl/>
       </w:pPr>
       <w:r>
-        <w:t>8월 18일 이후에도 27개 날짜에 마무리 기록이 남아 있습니다. 2026-08-11~2026-09-30의 전체 기록은 33일이고, 마무리 32건 중 ‘실천했다’는 30회, ‘일부 실천했다’와 ‘못 했다’는 각각 1회와 1회입니다. 이 숫자는 출석률이나 실력 점수가 아닙니다. 잘되지 않은 날을 적고 그 뒤에도 행동을 돌아본 흔적입니다.</w:t>
+        <w:t>저는 그 제안을 받아들여 기록 없이 진행하던 방식을 바꾸고, 업무를 처리하면서 내용을 남겼습니다. 제 일하는 방식이 동료의 의견을 반영하는 방향으로 달라졌습니다. 협업에서도 의견을 듣고 동의하는 데서 끝내지 않고, 제가 바꿀 수 있는 행동부터 실행하겠습니다.</w:t>
+      </w:r>
+    </w:p>
+    <w:p>
+      <w:pPr>
+        <w:pStyle w:val="Heading1"/>
+        <w:pageBreakBefore/>
+      </w:pPr>
+      <w:r>
+        <w:t>사용자 의견을 AI 구현의 요구사항으로 바꾼 경험</w:t>
       </w:r>
     </w:p>
     <w:p>
@@ -63,7 +94,7 @@
         <w:widowControl/>
       </w:pPr>
       <w:r>
-        <w:t>사람을 대하는 태도도 작은 장면에서 확인할 수 있습니다. 8월 25일 기록에는 막히는 부분을 빠르게 도와 작업을 끝낼 수 있었다는 동료의 감사가 있습니다. 28일에는 지하철 자리를 양보했다고 적었고, 9월 9일에는 주변 사람들의 말을 들어주며 대화를 편하게 해주고 싶었다고 기록했습니다. 이 장면의 날짜는 기록 작성일입니다. 과거 경험이 이 행동들을 직접 만들었다고 단정할 수는 없지만, 지금 제가 선택한 문제 해결과 학습 도움, 배려, 경청을 설명해 줍니다.</w:t>
+        <w:t>저는 AI를 활용할 때 사용자의 불편을 구체적인 요구사항으로 바꾸는 역할에 집중합니다. 야구 관람을 기록하는 직관노트를 만들면서, 친구에게 첫 화면의 로그인 부담과 구장 직접 입력의 번거로움에 대한 의견을 받았습니다.</w:t>
       </w:r>
     </w:p>
     <w:p>
@@ -71,7 +102,7 @@
         <w:widowControl/>
       </w:pPr>
       <w:r>
-        <w:t>맡은 일을 이어가려는 모습은 9월 2일 기록에도 있습니다. 팀 과제를 완수하기 위해 주말 시간을 써서 마무리했다고 적었습니다. 어떤 과제인지는 확인되지 않아 특정 프로젝트의 성과로 붙이지 않았습니다. 과제 10에서는 AI와 함께 공개자료를 검토하고 논문을 정리했습니다. 원자료와 표, 한계를 확인한 뒤 가설을 현재 자료만으로 판단하기 어렵다는 결론을 직접 선택했습니다. 제가 기대한 결론보다 확인한 근거에 맞춰 결과를 설명하는 경험이었습니다.</w:t>
+        <w:t>저는 소개 화면과 로그인 없는 샘플 체험을 추가하고, 주요 구장은 목록에서 고르되 다른 구장은 직접 입력할 수 있도록 개선을 요청했습니다. 응원팀을 매번 입력하는 불편에는 계정별 응원팀 저장과 새 기록의 자동 입력 기능을 요청했습니다. 기존 서비스와 데이터를 보존하면서 기존 인프라를 활용하도록 방향도 정했습니다.</w:t>
       </w:r>
     </w:p>
     <w:p>
@@ -79,7 +110,15 @@
         <w:widowControl/>
       </w:pPr>
       <w:r>
-        <w:t>과제 11의 소설에서는 여러 시기의 저를 돌아보았습니다. 이제는 무엇을 듣고 어떻게 움직였는지 실제 기록과 함께 보여주고 싶습니다. 아직 고칠 점이 남아 있고 취업 준비도 진행 중입니다. 지금까지의 기록을 바탕으로 다음 행동을 점검하겠습니다.</w:t>
+        <w:t>화면·기능 구현과 배포, 기술 검증은 AI가 수행했습니다. 개선한 서비스를 공개했으며, AI의 실제 계정 테스트 기록에서 재로그인 후 응원팀 유지와 경기·사진 저장, 인증 메일 처리가 확인됐습니다. 사용자 요구를 정한 제 역할과 AI의 구현·검증을 구분해 기록했습니다. 앞으로도 AI에 맡길 구현 내용과 제가 결정할 사용자 요구를 명확히 하겠습니다.</w:t>
+      </w:r>
+    </w:p>
+    <w:p>
+      <w:pPr>
+        <w:pStyle w:val="Heading1"/>
+      </w:pPr>
+      <w:r>
+        <w:t>근거의 범위에 맞춰 결론을 정한 경험</w:t>
       </w:r>
     </w:p>
     <w:p>
@@ -87,10 +126,28 @@
         <w:widowControl/>
       </w:pPr>
       <w:r>
-        <w:t>앞으로 상대방의 말을 잘 들어주고 첫 인상에 좋은 기분을 주는 사람이 되고 싶습니다.</w:t>
+        <w:t>저는 기대한 결론보다 확인한 자료의 범위에 맞춰 판단합니다. 공개자료 연구 과제에서 군 복무 중 휴대전화 사용 허용과 외부 소통이 스트레스 및 복무염증 감소와 연결되는지 살펴봤습니다.</w:t>
+      </w:r>
+    </w:p>
+    <w:p>
+      <w:pPr>
+        <w:widowControl/>
+      </w:pPr>
+      <w:r>
+        <w:t>저는 연구할 가설과 관심 분야를 선택하고, 과제의 판단 기준을 제공했습니다. 이후 AI와 함께 정리한 원자료와 표, 자료의 한계를 확인했습니다. 정책에 대한 긍정적 인식과 스트레스 감소의 인과효과를 같은 근거로 볼 수 있는지 검토하고, 최종 결론을 현재 자료만으로 판단하기 어렵다는 내용으로 직접 선택했습니다.</w:t>
+      </w:r>
+    </w:p>
+    <w:p>
+      <w:pPr>
+        <w:widowControl/>
+      </w:pPr>
+      <w:r>
+        <w:t>결과물에는 정책 관련 6개 지표의 두 시점 값과 차이, 해석의 한계를 정리했습니다. 정책 인식 수치를 실제 스트레스 감소 효과로 바꾸어 주장하지 않았습니다. 보안 업무에서도 관측한 사실과 추정을 구분하고, 판단에 필요한 근거가 부족하면 그 한계를 분명히 설명하겠습니다.</w:t>
       </w:r>
     </w:p>
     <w:sectPr>
+      <w:headerReference w:type="default" r:id="rId9"/>
+      <w:footerReference w:type="default" r:id="rId10"/>
       <w:pgSz w:w="11906" w:h="16838"/>
       <w:pgMar w:top="1020" w:right="1134" w:bottom="1020" w:left="1134" w:header="720" w:footer="720" w:gutter="0"/>
       <w:cols w:space="720"/>
@@ -98,6 +155,26 @@
     </w:sectPr>
   </w:body>
 </w:document>
+</file>
+
+<file path=word/footer1.xml><?xml version="1.0" encoding="utf-8"?>
+<w:ftr xmlns:m="http://schemas.openxmlformats.org/officeDocument/2006/math" xmlns:mc="http://schemas.openxmlformats.org/markup-compatibility/2006" xmlns:mo="http://schemas.microsoft.com/office/mac/office/2008/main" xmlns:mv="urn:schemas-microsoft-com:mac:vml" xmlns:o="urn:schemas-microsoft-com:office:office" xmlns:r="http://schemas.openxmlformats.org/officeDocument/2006/relationships" xmlns:v="urn:schemas-microsoft-com:vml" xmlns:w10="urn:schemas-microsoft-com:office:word" xmlns:w14="http://schemas.microsoft.com/office/word/2010/wordml" xmlns:w="http://schemas.openxmlformats.org/wordprocessingml/2006/main" xmlns:wne="http://schemas.microsoft.com/office/word/2006/wordml" xmlns:wp14="http://schemas.microsoft.com/office/word/2010/wordprocessingDrawing" xmlns:wp="http://schemas.openxmlformats.org/drawingml/2006/wordprocessingDrawing" xmlns:wpc="http://schemas.microsoft.com/office/word/2010/wordprocessingCanvas" xmlns:wpg="http://schemas.microsoft.com/office/word/2010/wordprocessingGroup" xmlns:wpi="http://schemas.microsoft.com/office/word/2010/wordprocessingInk" xmlns:wps="http://schemas.microsoft.com/office/word/2010/wordprocessingShape" mc:Ignorable="w14 wp14">
+  <w:p>
+    <w:pPr>
+      <w:pStyle w:val="Footer"/>
+    </w:pPr>
+  </w:p>
+</w:ftr>
+</file>
+
+<file path=word/header1.xml><?xml version="1.0" encoding="utf-8"?>
+<w:hdr xmlns:m="http://schemas.openxmlformats.org/officeDocument/2006/math" xmlns:mc="http://schemas.openxmlformats.org/markup-compatibility/2006" xmlns:mo="http://schemas.microsoft.com/office/mac/office/2008/main" xmlns:mv="urn:schemas-microsoft-com:mac:vml" xmlns:o="urn:schemas-microsoft-com:office:office" xmlns:r="http://schemas.openxmlformats.org/officeDocument/2006/relationships" xmlns:v="urn:schemas-microsoft-com:vml" xmlns:w10="urn:schemas-microsoft-com:office:word" xmlns:w14="http://schemas.microsoft.com/office/word/2010/wordml" xmlns:w="http://schemas.openxmlformats.org/wordprocessingml/2006/main" xmlns:wne="http://schemas.microsoft.com/office/word/2006/wordml" xmlns:wp14="http://schemas.microsoft.com/office/word/2010/wordprocessingDrawing" xmlns:wp="http://schemas.openxmlformats.org/drawingml/2006/wordprocessingDrawing" xmlns:wpc="http://schemas.microsoft.com/office/word/2010/wordprocessingCanvas" xmlns:wpg="http://schemas.microsoft.com/office/word/2010/wordprocessingGroup" xmlns:wpi="http://schemas.microsoft.com/office/word/2010/wordprocessingInk" xmlns:wps="http://schemas.microsoft.com/office/word/2010/wordprocessingShape" mc:Ignorable="w14 wp14">
+  <w:p>
+    <w:pPr>
+      <w:pStyle w:val="Header"/>
+    </w:pPr>
+  </w:p>
+</w:hdr>
 </file>
 
 <file path=word/numbering.xml><?xml version="1.0" encoding="utf-8"?>
@@ -464,12 +541,13 @@
     <w:qFormat/>
     <w:rsid w:val="00FC693F"/>
     <w:pPr>
-      <w:spacing w:after="140" w:line="283" w:lineRule="auto"/>
+      <w:spacing w:after="160" w:line="336" w:lineRule="auto"/>
     </w:pPr>
     <w:rPr>
       <w:rFonts w:ascii="Malgun Gothic" w:hAnsi="Malgun Gothic" w:eastAsia="Malgun Gothic" w:cs="Malgun Gothic"/>
       <w:color w:val="000000"/>
-      <w:sz w:val="21"/>
+      <w:sz w:val="22"/>
+      <w:u w:val="none"/>
     </w:rPr>
   </w:style>
   <w:style w:type="paragraph" w:styleId="Header">
@@ -527,7 +605,7 @@
     <w:pPr>
       <w:keepNext/>
       <w:keepLines/>
-      <w:spacing w:before="480" w:after="140" w:line="283" w:lineRule="auto"/>
+      <w:spacing w:before="300" w:after="160" w:line="336" w:lineRule="auto"/>
       <w:outlineLvl w:val="0"/>
     </w:pPr>
     <w:rPr>
@@ -535,8 +613,9 @@
       <w:b/>
       <w:bCs/>
       <w:color w:val="000000"/>
-      <w:sz w:val="26"/>
+      <w:sz w:val="24"/>
       <w:szCs w:val="28"/>
+      <w:u w:val="none"/>
     </w:rPr>
   </w:style>
   <w:style w:type="paragraph" w:styleId="Heading2">
@@ -813,7 +892,7 @@
     <w:qFormat/>
     <w:rsid w:val="00FC693F"/>
     <w:pPr>
-      <w:spacing w:after="140" w:line="283" w:lineRule="auto"/>
+      <w:spacing w:after="160" w:line="336" w:lineRule="auto"/>
       <w:contextualSpacing/>
     </w:pPr>
     <w:rPr>
@@ -821,8 +900,9 @@
       <w:color w:val="000000"/>
       <w:spacing w:val="5"/>
       <w:kern w:val="28"/>
-      <w:sz w:val="48"/>
+      <w:sz w:val="38"/>
       <w:szCs w:val="52"/>
+      <w:u w:val="none"/>
     </w:rPr>
   </w:style>
   <w:style w:type="character" w:customStyle="1" w:styleId="TitleChar">
@@ -852,15 +932,17 @@
       <w:numPr>
         <w:ilvl w:val="1"/>
       </w:numPr>
+      <w:spacing w:after="160" w:line="336" w:lineRule="auto"/>
     </w:pPr>
     <w:rPr>
-      <w:rFonts w:asciiTheme="majorHAnsi" w:eastAsiaTheme="majorEastAsia" w:hAnsiTheme="majorHAnsi" w:cstheme="majorBidi"/>
+      <w:rFonts w:asciiTheme="majorHAnsi" w:eastAsiaTheme="majorEastAsia" w:hAnsiTheme="majorHAnsi" w:cstheme="majorBidi" w:ascii="Malgun Gothic" w:hAnsi="Malgun Gothic" w:eastAsia="Malgun Gothic"/>
       <w:i/>
       <w:iCs/>
-      <w:color w:val="4F81BD" w:themeColor="accent1"/>
+      <w:color w:val="000000"/>
       <w:spacing w:val="15"/>
-      <w:sz w:val="24"/>
+      <w:sz w:val="20"/>
       <w:szCs w:val="24"/>
+      <w:u w:val="none"/>
     </w:rPr>
   </w:style>
   <w:style w:type="character" w:customStyle="1" w:styleId="SubtitleChar">

</xml_diff>

<commit_message>
Rewrite self introduction around infrastructure and development experience
</commit_message>
<xml_diff>
--- a/br-a/site/documents/self-introduction.docx
+++ b/br-a/site/documents/self-introduction.docx
@@ -59,9 +59,9 @@
                 <w:b/>
                 <w:bCs/>
                 <w:sz w:val="22"/>
-                <w:szCs w:val="22"/>
-              </w:rPr>
-              <w:t xml:space="preserve">1. 지원동기</w:t>
+                <w:szCs w:val="20"/>
+              </w:rPr>
+              <w:t>1. 지원동기</w:t>
             </w:r>
           </w:p>
         </w:tc>
@@ -88,11 +88,11 @@
               <w:rPr>
                 <w:b/>
                 <w:bCs/>
-                <w:color w:val="0000FF"/>
+                <w:color w:val="000000"/>
                 <w:sz w:val="22"/>
-                <w:szCs w:val="22"/>
-              </w:rPr>
-              <w:t xml:space="preserve">운영 경험을 바탕으로 서비스의 문제를 해결하겠습니다</w:t>
+                <w:szCs w:val="20"/>
+              </w:rPr>
+              <w:t>개발과 운영 경험을 바탕으로 서비스의 안정성을 지키겠습니다</w:t>
             </w:r>
           </w:p>
         </w:tc>
@@ -121,11 +121,13 @@
             <w:r>
               <w:rPr>
                 <w:sz w:val="22"/>
-                <w:szCs w:val="22"/>
-              </w:rPr>
-              <w:t xml:space="preserve">공공기관 웹 시스템을 유지보수하며 기능 구현만큼 기존 코드와 운영 흐름을 이해하는 일이 중요하다는 것을 배웠습니다. 군 복무 중 정보통신 장비와 계정·접근권한을 관리한 경험도 서비스 운영과 보안을 함께 살피는 바탕이 됐습니다.</w:t>
+                <w:szCs w:val="20"/>
+              </w:rPr>
+              <w:t>저는 웹 시스템의 인증·데이터 흐름을 이해하고, 운영 환경의 문제를 해결하는 보안 인프라·개발 업무에 지원합니다. 육군 정보통신 하사로 C4I 서버와 정보통신 장비를 운영·유지보수하며 장애 대응과 계정·접근권한 관리를 수행했고, 신라시스템에서는 공공기관 웹 시스템의 기능 개선과 오류 수정을 담당했습니다.</w:t>
               <w:br/>
-              <w:t xml:space="preserve">신라시스템에서 Java·Spring 기반 기능 개선과 오류 수정을 경험했고, 현재 AI 보안·인프라 교육을 통해 Linux, 네트워크, 탐지와 모니터링을 학습하고 있습니다. 입사 후에는 담당 시스템의 구조와 업무를 먼저 익히고, 재현 가능한 근거로 문제를 분석하는 구성원이 되고자 합니다.</w:t>
+              <w:t>의왕시 통합예약시스템에서는 도서관 시스템으로 이어지는 JWT 로그인 연계와 강좌 현황 연계 기능을 개발하고 추첨 로직 오류를 수정했습니다. 기존 코드와 외부 시스템의 연결 방식을 살펴보고, 수정한 기능이 개발 서버에서 정상 동작하는지 확인했습니다. 이 과정에서 서비스의 안정성을 위해서는 기능 구현과 함께 인증과 시스템 간 연계 흐름을 이해해야 한다는 점을 배웠습니다.</w:t>
+              <w:br/>
+              <w:t>현재는 AI 보안·인프라 교육에서 Linux, 네트워크, 방화벽·VPN, 탐지와 모니터링을 학습하고 있습니다. 서버·장비 운영 경험에 웹 개발 경험과 보안 지식을 더해, 서비스 구조를 이해하고 변경의 영향을 살피는 구성원으로 기여하겠습니다.</w:t>
             </w:r>
           </w:p>
         </w:tc>
@@ -158,9 +160,9 @@
                 <w:b/>
                 <w:bCs/>
                 <w:sz w:val="22"/>
-                <w:szCs w:val="22"/>
-              </w:rPr>
-              <w:t xml:space="preserve">2. 성장과정</w:t>
+                <w:szCs w:val="20"/>
+              </w:rPr>
+              <w:t>2. 성장과정</w:t>
             </w:r>
           </w:p>
         </w:tc>
@@ -182,10 +184,11 @@
             </w:pPr>
             <w:r>
               <w:rPr>
+                <w:color w:val="000000"/>
                 <w:sz w:val="22"/>
-                <w:szCs w:val="22"/>
-              </w:rPr>
-              <w:t xml:space="preserve">조언을 받아 업무를 기록하는 습관을 만들었습니다</w:t>
+                <w:szCs w:val="20"/>
+              </w:rPr>
+              <w:t>들은 의견을 실제 행동으로 바꾸며 성장했습니다</w:t>
             </w:r>
           </w:p>
         </w:tc>
@@ -214,11 +217,13 @@
             <w:r>
               <w:rPr>
                 <w:sz w:val="22"/>
-                <w:szCs w:val="22"/>
-              </w:rPr>
-              <w:t xml:space="preserve">2023년 군 복무 당시에는 업무를 처리하고도 내용을 충분히 남기지 않았습니다. 상관에게 업무를 기록해 보라는 조언을 받았고, 이후 수행한 일과 확인할 내용을 기록하는 방식으로 행동을 바꿨습니다.</w:t>
+                <w:szCs w:val="20"/>
+              </w:rPr>
+              <w:t>저는 다른 사람의 의견을 받아들여 일하는 방식을 바꿔 왔습니다. 2023년 군 복무 당시에는 업무를 처리한 내용을 충분히 기록하지 않았습니다. 반장이 업무를 기록해 보라고 조언했고, 저는 이를 받아들여 수행한 내용을 남기는 방식으로 행동을 바꿨습니다.</w:t>
               <w:br/>
-              <w:t xml:space="preserve">이 경험은 다른 사람의 의견을 듣고 제 행동을 수정하는 계기가 됐습니다. 지금도 과제와 프로젝트에서 판단한 이유와 확인되지 않은 내용을 구분해 남기려고 합니다. 기록으로 오류가 얼마나 줄었는지는 측정하지 않았지만, 업무를 돌아보고 다음 행동을 정하는 기준을 갖게 됐습니다.</w:t>
+              <w:t>이러한 태도는 개인 프로젝트 직관노트에서도 이어졌습니다. 야구 관람 기록 서비스를 본 친구가 첫 화면의 로그인 부담과 구장·응원팀의 반복 입력이 불편하다는 의견을 줬습니다. 저는 이를 첫 진입과 기록 작성 과정의 문제로 나누고, 소개 화면과 로그인 없는 샘플 체험, 구장 선택과 기타 직접 입력, 계정별 응원팀 저장 기능을 요청했습니다.</w:t>
+              <w:br/>
+              <w:t>기존 데이터를 보존한다는 조건도 정했으며, 구현과 배포·기술 검증은 AI가 수행했습니다. 요청한 기능은 공개 서비스에 반영됐습니다. 조언에 동의하는 데서 멈추지 않고 제 업무 방식과 서비스 요구사항을 바꾼 경험을 바탕으로, 동료와 사용자의 의견을 구체적인 개선 행동으로 연결하겠습니다.</w:t>
             </w:r>
           </w:p>
         </w:tc>
@@ -251,9 +256,9 @@
                 <w:b/>
                 <w:bCs/>
                 <w:sz w:val="22"/>
-                <w:szCs w:val="22"/>
-              </w:rPr>
-              <w:t xml:space="preserve">3. 성격의 장단점</w:t>
+                <w:szCs w:val="20"/>
+              </w:rPr>
+              <w:t>3. 성격의 장단점</w:t>
             </w:r>
           </w:p>
         </w:tc>
@@ -275,10 +280,11 @@
             </w:pPr>
             <w:r>
               <w:rPr>
+                <w:color w:val="000000"/>
                 <w:sz w:val="22"/>
-                <w:szCs w:val="22"/>
-              </w:rPr>
-              <w:t xml:space="preserve">기대보다 근거를 우선하고 집중은 기록으로 점검합니다</w:t>
+                <w:szCs w:val="20"/>
+              </w:rPr>
+              <w:t>기대한 결론보다 근거를 우선하며 부족한 습관은 돌아봅니다</w:t>
             </w:r>
           </w:p>
         </w:tc>
@@ -307,11 +313,13 @@
             <w:r>
               <w:rPr>
                 <w:sz w:val="22"/>
-                <w:szCs w:val="22"/>
-              </w:rPr>
-              <w:t xml:space="preserve">자료가 기대한 결론을 뒷받침하는지 다시 살피는 편입니다. 공개자료 연구 과제에서 휴대전화 사용 허용과 외부 소통·스트레스의 관계를 검토했습니다. AI가 정리한 원자료와 표, 한계를 확인한 뒤 현재 자료만으로 가설을 판단하기 어렵다는 결론을 선택했습니다.</w:t>
+                <w:szCs w:val="20"/>
+              </w:rPr>
+              <w:t>제 강점은 원하는 결론이 나오더라도 근거가 충분한지 다시 확인하는 태도입니다. 공개자료 연구 과제에서 병사의 휴대전화 사용 허용과 외부 소통이 스트레스 감소로 이어지는지 검토했습니다. 저는 연구 가설을 선택하고, AI가 정리한 원자료와 결과표를 보며 정책에 대한 긍정적인 인식이 실제 스트레스 감소를 입증하는지 확인했습니다.</w:t>
               <w:br/>
-              <w:t xml:space="preserve">6개 지표의 두 시점 값과 차이가 있다는 사실을 독립적인 응답자 12명의 분석으로 확대하지 않았고, 정책 인식과 인과효과를 구분했습니다. 한편 수업 중 집중을 꾸준히 유지하는 데 보완이 필요하다고 느껴 리추얼 기록으로 행동을 돌아보고 있습니다. 개선을 수치로 단정하기보다 실행 여부를 확인하며 이어가겠습니다.</w:t>
+              <w:t>검토 결과, 정책 인식에 관한 집계 수치만으로 스트레스 감소의 원인과 효과를 판단하기는 어려웠습니다. 저는 최종 결론을 현재 자료만으로 판단하기 어렵다는 내용으로 정하고, 결과물에 그 이유와 해석 범위를 남겼습니다. 이 경험은 보안 업무에서도 관측한 사실과 추정을 구분해 판단하는 태도로 이어가고 싶습니다.</w:t>
+              <w:br/>
+              <w:t>보완할 점은 수업 중 집중을 꾸준히 유지하는 습관입니다. 이를 돌아보기 위해 리추얼 기록에 학습 중의 행동을 남기고 있습니다. 부족한 점을 막연히 넘기지 않고 기록으로 확인하는 방식을 이어가겠습니다.</w:t>
             </w:r>
           </w:p>
         </w:tc>
@@ -376,9 +384,9 @@
                 <w:b/>
                 <w:bCs/>
                 <w:sz w:val="22"/>
-                <w:szCs w:val="22"/>
-              </w:rPr>
-              <w:t xml:space="preserve">4. 입사 후 포부</w:t>
+                <w:szCs w:val="20"/>
+              </w:rPr>
+              <w:t>4. 입사 후 포부</w:t>
             </w:r>
           </w:p>
         </w:tc>
@@ -400,10 +408,11 @@
             </w:pPr>
             <w:r>
               <w:rPr>
+                <w:color w:val="000000"/>
                 <w:sz w:val="22"/>
-                <w:szCs w:val="22"/>
-              </w:rPr>
-              <w:t xml:space="preserve">업무 흐름과 검증 기준을 먼저 익히겠습니다</w:t>
+                <w:szCs w:val="20"/>
+              </w:rPr>
+              <w:t>담당 시스템을 익히고 변경 전후의 동작으로 신뢰를 쌓겠습니다</w:t>
             </w:r>
           </w:p>
         </w:tc>
@@ -432,11 +441,13 @@
             <w:r>
               <w:rPr>
                 <w:sz w:val="22"/>
-                <w:szCs w:val="22"/>
-              </w:rPr>
-              <w:t xml:space="preserve">초기에는 담당 서비스의 화면·API·데이터 흐름과 운영 절차를 파악하고, 변경 전후에 확인할 항목을 정리하겠습니다. 장애가 발생하면 로그와 SQL, 재현 조건을 함께 확인해 원인을 좁히고 수정 결과를 기록하겠습니다.</w:t>
+                <w:szCs w:val="20"/>
+              </w:rPr>
+              <w:t>입사 후에는 담당 시스템의 구조와 정상 동작을 먼저 익힌 뒤, 변경 결과를 설명할 수 있는 구성원이 되겠습니다. 초기에는 운영 절차와 장애 대응 기준을 배우고, 사용자 요청이 화면·API·데이터베이스와 서버·네트워크를 거쳐 처리되는 흐름을 파악하겠습니다. 계정과 접근권한, 인증 연계가 어디에서 이루어지는지도 함께 확인하겠습니다.</w:t>
               <w:br/>
-              <w:t xml:space="preserve">AI 도구를 활용할 때도 제안된 코드와 실제 업무 조건을 대조하겠습니다. 개발 환경에서 확인한 결과와 운영 환경에서 확인한 결과를 구분하고, 동료가 변경 이유와 남은 과제를 이해할 수 있게 전달하겠습니다. 웹 유지보수 경험과 보안·인프라 학습을 연결해 맡은 시스템을 안정적으로 운영하는 데 기여하고 싶습니다.</w:t>
+              <w:t>개발 업무에서는 기존 코드와 SQL, 로그를 근거로 문제의 범위를 좁히고, 수정 후에는 정상 흐름과 오류 조건을 확인하겠습니다. 보안 인프라 업무에서는 장비·서버 상태와 탐지·모니터링 정보를 운영 맥락에서 이해하며, 조치 결과와 남은 과제를 동료가 이어받을 수 있도록 기록하겠습니다.</w:t>
+              <w:br/>
+              <w:t>AI 도구는 구현 방향과 원인 후보를 탐색하는 데 활용하되, 적용 여부는 실제 코드와 업무 조건을 대조해 판단하겠습니다. 개발 서버에서 확인한 결과를 운영 환경의 성과로 확대하지 않고, 맡은 범위의 동작을 확인하며 신뢰를 쌓겠습니다.</w:t>
             </w:r>
           </w:p>
         </w:tc>
@@ -469,9 +480,9 @@
                 <w:b/>
                 <w:bCs/>
                 <w:sz w:val="22"/>
-                <w:szCs w:val="22"/>
-              </w:rPr>
-              <w:t xml:space="preserve">5. 직무 관련 경험</w:t>
+                <w:szCs w:val="20"/>
+              </w:rPr>
+              <w:t>5. 직무 관련 경험</w:t>
             </w:r>
           </w:p>
         </w:tc>
@@ -493,10 +504,11 @@
             </w:pPr>
             <w:r>
               <w:rPr>
+                <w:color w:val="000000"/>
                 <w:sz w:val="22"/>
-                <w:szCs w:val="22"/>
-              </w:rPr>
-              <w:t xml:space="preserve">기존 코드 분석과 사용자 의견 반영을 경험했습니다</w:t>
+                <w:szCs w:val="20"/>
+              </w:rPr>
+              <w:t>기존 코드를 분석해 인증 연계와 운영 기능을 개선했습니다</w:t>
             </w:r>
           </w:p>
         </w:tc>
@@ -526,11 +538,12 @@
               <w:rPr>
                 <w:rFonts w:ascii="돋움" w:eastAsia="돋움" w:hAnsi="돋움"/>
                 <w:sz w:val="22"/>
-                <w:szCs w:val="22"/>
-              </w:rPr>
-              <w:t xml:space="preserve">신라시스템의 의왕시 통합예약시스템 구축에 참여하며 JWT 로그인 연계, 추첨 로직 오류 수정, 강좌 현황 연계 기능을 담당했습니다. 기존 코드와 라이브러리 연결 방식을 확인하고, AI 코딩 도구의 제안을 업무 조건과 대조하며 수정했습니다. 수정 후 개발 서버에서 정상 동작을 확인했습니다. 운영 성능이나 이용자 지표의 개선 수치는 확인하지 않았습니다.</w:t>
+              </w:rPr>
+              <w:t>저는 의왕시 통합예약시스템의 운영 단계에서 JWT 로그인 연계, 추첨 로직 오류 수정, 강좌 현황 연계 기능을 담당했습니다. 구축이 완료된 시스템에 기능을 추가하고 오류를 수정해야 했기 때문에, 기존 구조와 연결 방식을 먼저 이해하는 것이 과제였습니다.</w:t>
               <w:br/>
-              <w:t xml:space="preserve">개인 프로젝트 직관노트에서는 서비스 주제와 필요한 기능을 결정했습니다. 친구가 전한 로그인 부담과 구장·응원팀 반복 입력 의견을 받아 소개 화면과 샘플 체험, 구장 선택, 응원팀 저장 기능을 요청했습니다. 기존 데이터와 인프라를 보존하는 방향도 정했습니다. 화면·기능 구현과 배포·기술 검증은 AI가 수행했습니다. 공개 서비스에 개선이 반영됐으며, 개선 후 친구의 재사용 평가나 만족도 변화는 아직 확인하지 않았습니다.</w:t>
+              <w:t>Java, Spring, JSP, MariaDB, MyBatis로 구성된 기존 코드를 분석하고, 통합예약시스템에서 도서관 시스템으로 이어지는 JWT 기반 로그인 연계 기능을 구현했습니다. 추첨 로직의 오류를 분석해 수정했으며, 강좌 현황을 연계하는 기능도 개발했습니다. AI 코딩 도구는 코드 초안과 구현 방향, 오류 원인 후보를 탐색하는 데 활용했습니다. 제안된 내용은 기존 코드와 라이브러리의 연결 방식, 업무 조건에 맞는지 직접 검토하고 수정했습니다.</w:t>
+              <w:br/>
+              <w:t>이후 개발 서버에서 로그인·강좌 현황 연계와 수정한 추첨 기능의 정상 동작을 확인했습니다. 이 경험을 통해 새 코드를 작성하는 것뿐 아니라 기존 구조를 이해하고, 외부 시스템과의 연결 및 수정 결과까지 확인하는 운영 개발 경험을 쌓았습니다. 이 경험을 보안 인프라·개발 업무에서 인증과 서비스 동작을 함께 살피는 기반으로 삼겠습니다.</w:t>
             </w:r>
           </w:p>
         </w:tc>

</xml_diff>